<commit_message>
Rewrite dataset documentation in first person
</commit_message>
<xml_diff>
--- a/docs/SmartQ_100k_Synthetic_Dataset_Documentation.docx
+++ b/docs/SmartQ_100k_Synthetic_Dataset_Documentation.docx
@@ -430,12 +430,7 @@
         <w:jc w:val="center"/>
       </w:pPr>
       <w:r>
-        <w:rPr>
-          <w:rFonts w:ascii="Aptos" w:hAnsi="Aptos"/>
-          <w:color w:val="666666"/>
-          <w:sz w:val="19"/>
-        </w:rPr>
-        <w:t>Prepared as supporting documentation for the Smart Q synthetic dataset.</w:t>
+        <w:t>I prepared this document as supporting documentation for my SmartQ synthetic dataset.</w:t>
       </w:r>
     </w:p>
     <w:p>
@@ -469,13 +464,7 @@
         <w:spacing w:after="100" w:line="259" w:lineRule="auto"/>
       </w:pPr>
       <w:r>
-        <w:rPr>
-          <w:rFonts w:ascii="Aptos" w:hAnsi="Aptos"/>
-          <w:i w:val="0"/>
-          <w:color w:val="1F1F1F"/>
-          <w:sz w:val="21"/>
-        </w:rPr>
-        <w:t>This document explains what the 100,000-row Smart Q dataset represents, how the synthetic records were generated, what every field means, how the dataset was validated, and how it should be used in statistical and machine-learning experiments.</w:t>
+        <w:t>In this document I explain what my 100,000-row SmartQ dataset represents, how I generated the synthetic records, what the fields mean, how I validated the dataset, and how I use it in my statistical and machine-learning work.</w:t>
       </w:r>
     </w:p>
     <w:tbl>
@@ -897,30 +886,10 @@
             </w:tcBorders>
           </w:tcPr>
           <w:p>
-            <w:pPr>
-              <w:spacing w:after="40"/>
-            </w:pPr>
-            <w:r>
-              <w:rPr>
-                <w:rFonts w:ascii="Aptos" w:hAnsi="Aptos"/>
-                <w:b/>
-                <w:color w:val="C55A11"/>
-                <w:sz w:val="21"/>
-              </w:rPr>
+            <w:r>
               <w:t>Important academic disclosure</w:t>
-            </w:r>
-          </w:p>
-          <w:p>
-            <w:pPr>
-              <w:spacing w:after="0"/>
-            </w:pPr>
-            <w:r>
-              <w:rPr>
-                <w:rFonts w:ascii="Aptos" w:hAnsi="Aptos"/>
-                <w:color w:val="1F1F1F"/>
-                <w:sz w:val="20"/>
-              </w:rPr>
-              <w:t>The dataset is synthetic. It is designed to reproduce plausible Smart Q operating behaviour and to support method development, not to claim measured performance of a real government or business queue.</w:t>
+              <w:br/>
+              <w:t>I generated this dataset synthetically. I designed it to reproduce queue behaviour and ML conditions, but I do not present it as real customer data.</w:t>
             </w:r>
           </w:p>
         </w:tc>
@@ -955,13 +924,7 @@
         <w:spacing w:after="100" w:line="259" w:lineRule="auto"/>
       </w:pPr>
       <w:r>
-        <w:rPr>
-          <w:rFonts w:ascii="Aptos" w:hAnsi="Aptos"/>
-          <w:i w:val="0"/>
-          <w:color w:val="1F1F1F"/>
-          <w:sz w:val="21"/>
-        </w:rPr>
-        <w:t>The Smart Q Synthetic Operational Dataset contains 100,000 queue-related records generated from a reproducible simulation of the Smart Q operating model. Each row represents one customer visit or scheduled visit and records the information that would be available before service, the queue conditions around the visit, and - where the visit is completed - the observed waiting and service outcomes.</w:t>
+        <w:t>I generated my SmartQ Synthetic Operational Dataset with 100,000 queue-related records using a reproducible simulation of the SmartQ operating model. I treat each row as one customer visit or scheduled visit. The row records information available before service, the queue conditions around the visit, and - when the visit is completed - the observed waiting-time and service outcomes.</w:t>
       </w:r>
     </w:p>
     <w:p>
@@ -1951,13 +1914,7 @@
         <w:spacing w:after="100" w:line="259" w:lineRule="auto"/>
       </w:pPr>
       <w:r>
-        <w:rPr>
-          <w:rFonts w:ascii="Aptos" w:hAnsi="Aptos"/>
-          <w:i w:val="0"/>
-          <w:color w:val="1F1F1F"/>
-          <w:sz w:val="21"/>
-        </w:rPr>
-        <w:t>Daily counter availability is allowed to vary slightly to represent ordinary staffing or maintenance effects. This variation changes queue capacity and therefore changes waiting-time outcomes.</w:t>
+        <w:t>I allow daily counter availability to vary slightly so the simulation can represent ordinary staffing or maintenance effects. This changes queue capacity and therefore changes waiting-time outcomes.</w:t>
       </w:r>
     </w:p>
     <w:p>
@@ -2254,13 +2211,7 @@
         <w:spacing w:after="100" w:line="259" w:lineRule="auto"/>
       </w:pPr>
       <w:r>
-        <w:rPr>
-          <w:rFonts w:ascii="Aptos" w:hAnsi="Aptos"/>
-          <w:i w:val="0"/>
-          <w:color w:val="1F1F1F"/>
-          <w:sz w:val="21"/>
-        </w:rPr>
-        <w:t>Actual synthetic service duration is deliberately allowed to finish earlier than target, near target, or later than target. A small long-tail component produces occasional difficult or slow services. This creates a more useful learning problem than assigning the same service time to every customer.</w:t>
+        <w:t>I deliberately allow synthetic service duration to finish earlier than target, near target, or later than target. I also include a small long-tail component so some services take much longer. I did this because a fixed service time for every customer would create an unrealistically easy prediction problem.</w:t>
       </w:r>
     </w:p>
     <w:p>
@@ -2286,13 +2237,7 @@
         <w:spacing w:after="100" w:line="259" w:lineRule="auto"/>
       </w:pPr>
       <w:r>
-        <w:rPr>
-          <w:rFonts w:ascii="Aptos" w:hAnsi="Aptos"/>
-          <w:i w:val="0"/>
-          <w:color w:val="1F1F1F"/>
-          <w:sz w:val="21"/>
-        </w:rPr>
-        <w:t>Smart Q is designed to collect operational observations during real queue activity. However, a student research project often needs substantially more labelled data than is available during early development. The synthetic dataset was therefore generated to mirror the type of operational evidence that Smart Q would accumulate over many operating days.</w:t>
+        <w:t>I designed SmartQ to collect operational observations during real queue activity, but at this stage I do not yet have enough real labelled production data for a large ML experiment. I therefore generated a synthetic dataset that mirrors the type of operational evidence SmartQ could accumulate over many operating days.</w:t>
       </w:r>
     </w:p>
     <w:p>
@@ -2302,13 +2247,7 @@
         <w:spacing w:after="100" w:line="259" w:lineRule="auto"/>
       </w:pPr>
       <w:r>
-        <w:rPr>
-          <w:rFonts w:ascii="Aptos" w:hAnsi="Aptos"/>
-          <w:i w:val="0"/>
-          <w:color w:val="1F1F1F"/>
-          <w:sz w:val="21"/>
-        </w:rPr>
-        <w:t>Synthetic generation provides three practical benefits:</w:t>
+        <w:t>I used synthetic generation for three practical reasons:</w:t>
       </w:r>
     </w:p>
     <w:p>
@@ -2317,12 +2256,7 @@
         <w:spacing w:after="50"/>
       </w:pPr>
       <w:r>
-        <w:rPr>
-          <w:rFonts w:ascii="Aptos" w:hAnsi="Aptos"/>
-          <w:color w:val="1F1F1F"/>
-          <w:sz w:val="20"/>
-        </w:rPr>
-        <w:t>Scale: 100,000 observations are available immediately for model development and evaluation.</w:t>
+        <w:t>Scale: I can work with 100,000 observations immediately for model development and evaluation.</w:t>
       </w:r>
     </w:p>
     <w:p>
@@ -2331,12 +2265,7 @@
         <w:spacing w:after="50"/>
       </w:pPr>
       <w:r>
-        <w:rPr>
-          <w:rFonts w:ascii="Aptos" w:hAnsi="Aptos"/>
-          <w:color w:val="1F1F1F"/>
-          <w:sz w:val="20"/>
-        </w:rPr>
-        <w:t>Reproducibility: the fixed random seed means the same synthetic design can be regenerated consistently.</w:t>
+        <w:t>Reproducibility: I used a fixed random seed so I can regenerate the same synthetic design consistently.</w:t>
       </w:r>
     </w:p>
     <w:p>
@@ -2345,12 +2274,7 @@
         <w:spacing w:after="50"/>
       </w:pPr>
       <w:r>
-        <w:rPr>
-          <w:rFonts w:ascii="Aptos" w:hAnsi="Aptos"/>
-          <w:color w:val="1F1F1F"/>
-          <w:sz w:val="20"/>
-        </w:rPr>
-        <w:t>Privacy: the dataset contains no real names, usernames, email addresses, phone numbers, dates of birth, disability information or pregnancy information.</w:t>
+        <w:t>Privacy: I did not include real names, usernames, email addresses, phone numbers, dates of birth, disability information or pregnancy information.</w:t>
       </w:r>
     </w:p>
     <w:tbl>
@@ -2376,30 +2300,10 @@
             </w:tcBorders>
           </w:tcPr>
           <w:p>
-            <w:pPr>
-              <w:spacing w:after="40"/>
-            </w:pPr>
-            <w:r>
-              <w:rPr>
-                <w:rFonts w:ascii="Aptos" w:hAnsi="Aptos"/>
-                <w:b/>
-                <w:color w:val="3C8D9E"/>
-                <w:sz w:val="21"/>
-              </w:rPr>
-              <w:t>Priority privacy design</w:t>
-            </w:r>
-          </w:p>
-          <w:p>
-            <w:pPr>
-              <w:spacing w:after="0"/>
-            </w:pPr>
-            <w:r>
-              <w:rPr>
-                <w:rFonts w:ascii="Aptos" w:hAnsi="Aptos"/>
-                <w:color w:val="1F1F1F"/>
-                <w:sz w:val="20"/>
-              </w:rPr>
-              <w:t>The dataset records only the resulting queue_type (GENERAL or PRIORITY). The protected reason that caused a priority classification is intentionally excluded. This mirrors Smart Q's forecasting principle that the model should not require sensitive personal attributes.</w:t>
+            <w:r>
+              <w:t>My priority-privacy design</w:t>
+              <w:br/>
+              <w:t>I record only the resulting queue_type (GENERAL or PRIORITY). I do not include sensitive reasons such as disability or pregnancy in the synthetic ML dataset.</w:t>
             </w:r>
           </w:p>
         </w:tc>
@@ -2434,13 +2338,7 @@
         <w:spacing w:after="100" w:line="259" w:lineRule="auto"/>
       </w:pPr>
       <w:r>
-        <w:rPr>
-          <w:rFonts w:ascii="Aptos" w:hAnsi="Aptos"/>
-          <w:i w:val="0"/>
-          <w:color w:val="1F1F1F"/>
-          <w:sz w:val="21"/>
-        </w:rPr>
-        <w:t>The dataset can support a valid demonstration of data preparation, exploratory analysis, baseline construction, model training, validation and error comparison. It cannot prove that a trained model will achieve the same accuracy on a real production queue. Real deployment would still require evaluation on real, ethically collected operational data.</w:t>
+        <w:t>I use this dataset to demonstrate data preparation, EDA, baseline construction, model training, validation and error comparison. I do not use it to claim that my trained model will achieve the same accuracy in a real production queue. Before real deployment, I would still need ethically collected operational data and external validation.</w:t>
       </w:r>
     </w:p>
     <w:p>
@@ -2466,13 +2364,7 @@
         <w:spacing w:after="100" w:line="259" w:lineRule="auto"/>
       </w:pPr>
       <w:r>
-        <w:rPr>
-          <w:rFonts w:ascii="Aptos" w:hAnsi="Aptos"/>
-          <w:i w:val="0"/>
-          <w:color w:val="1F1F1F"/>
-          <w:sz w:val="21"/>
-        </w:rPr>
-        <w:t>The generator does not create independent random spreadsheet rows. It simulates operating days so that queue conditions and outcomes are related to one another. When demand is high, counters become busy, customers accumulate in the queue, people_ahead increases and waiting times can grow. When demand drops or more counter capacity is available, queues clear more quickly.</w:t>
+        <w:t>I did not generate independent random spreadsheet rows. I simulated operating days so queue conditions and outcomes are connected. When demand is high, counters become busy, customers accumulate, people_ahead rises and waits can grow. When demand drops or more counter capacity is available, queues can clear faster.</w:t>
       </w:r>
     </w:p>
     <w:p>
@@ -2498,13 +2390,7 @@
         <w:spacing w:after="100" w:line="259" w:lineRule="auto"/>
       </w:pPr>
       <w:r>
-        <w:rPr>
-          <w:rFonts w:ascii="Aptos" w:hAnsi="Aptos"/>
-          <w:i w:val="0"/>
-          <w:color w:val="1F1F1F"/>
-          <w:sz w:val="21"/>
-        </w:rPr>
-        <w:t>Operating activity is generated on weekdays. Appointments are placed in 15-minute slots between 08:00 and 17:45. Demand is intentionally non-uniform: morning and afternoon periods have higher arrival probability, while lunch and late-day periods are generally quieter. Branches also have different demand levels so that branch_code carries useful operational information.</w:t>
+        <w:t>I generate operating activity on weekdays. I place appointments in 15-minute slots between 08:00 and 17:45. I deliberately make demand non-uniform so morning and afternoon periods are busier while lunch and late-day periods are usually quieter. I also vary demand by branch so branch_code contains operational information.</w:t>
       </w:r>
     </w:p>
     <w:p>
@@ -2530,13 +2416,7 @@
         <w:spacing w:after="100" w:line="259" w:lineRule="auto"/>
       </w:pPr>
       <w:r>
-        <w:rPr>
-          <w:rFonts w:ascii="Aptos" w:hAnsi="Aptos"/>
-          <w:i w:val="0"/>
-          <w:color w:val="1F1F1F"/>
-          <w:sz w:val="21"/>
-        </w:rPr>
-        <w:t>Approximately 78% of generated visits are appointments and the remaining portion are walk-ins. Appointment customers may arrive early, on time or late. Walk-ins receive an arrival time directly rather than an appointment time.</w:t>
+        <w:t>I generate about 78% of visits as appointments and the rest as walk-ins. Appointment customers can arrive early, on time or late. Walk-ins receive an arrival time directly instead of an appointment time.</w:t>
       </w:r>
     </w:p>
     <w:tbl>
@@ -2876,13 +2756,7 @@
         <w:spacing w:after="100" w:line="259" w:lineRule="auto"/>
       </w:pPr>
       <w:r>
-        <w:rPr>
-          <w:rFonts w:ascii="Aptos" w:hAnsi="Aptos"/>
-          <w:i w:val="0"/>
-          <w:color w:val="1F1F1F"/>
-          <w:sz w:val="21"/>
-        </w:rPr>
-        <w:t>A key Smart Q concept used in this dataset is that physical arrival/check-in and service eligibility are separate. An appointment customer can arrive and check in early, but is not made call-eligible before the booked appointment time. A walk-in becomes eligible at check-in. The service_eligible_at field explicitly records this distinction.</w:t>
+        <w:t>I keep physical arrival/check-in separate from service eligibility. An appointment customer can arrive and check in early, but I do not make that customer call-eligible before the booked appointment time. A walk-in becomes eligible at check-in. I store this distinction explicitly in service_eligible_at.</w:t>
       </w:r>
     </w:p>
     <w:tbl>
@@ -2908,30 +2782,10 @@
             </w:tcBorders>
           </w:tcPr>
           <w:p>
-            <w:pPr>
-              <w:spacing w:after="40"/>
-            </w:pPr>
-            <w:r>
-              <w:rPr>
-                <w:rFonts w:ascii="Aptos" w:hAnsi="Aptos"/>
-                <w:b/>
-                <w:color w:val="2F75B5"/>
-                <w:sz w:val="21"/>
-              </w:rPr>
-              <w:t>Why this matters</w:t>
-            </w:r>
-          </w:p>
-          <w:p>
-            <w:pPr>
-              <w:spacing w:after="0"/>
-            </w:pPr>
-            <w:r>
-              <w:rPr>
-                <w:rFonts w:ascii="Aptos" w:hAnsi="Aptos"/>
-                <w:color w:val="1F1F1F"/>
-                <w:sz w:val="20"/>
-              </w:rPr>
-              <w:t>Separating check-in from service eligibility prevents the simulation from automatically serving an early appointment before its scheduled time. It also creates more realistic queue-state features because early-arriving customers can be present without immediately jumping ahead of eligible customers.</w:t>
+            <w:r>
+              <w:t>Why this matters to me</w:t>
+              <w:br/>
+              <w:t>By separating check-in from service eligibility, I prevent my simulation from serving appointment customers before their booked time. This fixes one of the important lessons I learned from earlier simulation work.</w:t>
             </w:r>
           </w:p>
         </w:tc>
@@ -2966,13 +2820,7 @@
         <w:spacing w:after="100" w:line="259" w:lineRule="auto"/>
       </w:pPr>
       <w:r>
-        <w:rPr>
-          <w:rFonts w:ascii="Aptos" w:hAnsi="Aptos"/>
-          <w:i w:val="0"/>
-          <w:color w:val="1F1F1F"/>
-          <w:sz w:val="21"/>
-        </w:rPr>
-        <w:t>For attended visits, Smart Q-style queue features are calculated around check-in time. They include people ahead in the same lane, General/Priority waiting counts, customers currently being served, open counter capacity, counter utilisation, queue pressure, estimated workload ahead and recent throughput.</w:t>
+        <w:t>For attended visits, I calculate SmartQ-style queue features around check-in time. These include people ahead in the same lane, General/Priority waiting counts, customers being served, open counter capacity, counter utilisation, queue pressure, estimated workload ahead and recent throughput.</w:t>
       </w:r>
     </w:p>
     <w:p>
@@ -2982,13 +2830,7 @@
         <w:spacing w:after="100" w:line="259" w:lineRule="auto"/>
       </w:pPr>
       <w:r>
-        <w:rPr>
-          <w:rFonts w:ascii="Aptos" w:hAnsi="Aptos"/>
-          <w:i w:val="0"/>
-          <w:color w:val="1F1F1F"/>
-          <w:sz w:val="21"/>
-        </w:rPr>
-        <w:t>Historical rolling features use only visits whose outcomes were already known before the current prediction time. For example, recent_avg_service_minutes_10 uses the ten most recently completed services known at the current customer's check-in. This design reduces look-ahead bias.</w:t>
+        <w:t>I calculate rolling-history features using only visits whose outcomes were already known before the current prediction time. For example, recent_avg_service_minutes_10 uses the ten most recently completed services known at that customer's check-in. I did this to reduce look-ahead bias.</w:t>
       </w:r>
     </w:p>
     <w:p>
@@ -3014,13 +2856,7 @@
         <w:spacing w:after="100" w:line="259" w:lineRule="auto"/>
       </w:pPr>
       <w:r>
-        <w:rPr>
-          <w:rFonts w:ascii="Aptos" w:hAnsi="Aptos"/>
-          <w:i w:val="0"/>
-          <w:color w:val="1F1F1F"/>
-          <w:sz w:val="21"/>
-        </w:rPr>
-        <w:t>General customers are served by General counters and Priority customers by Priority counters in this version of the synthetic generator. Customers are processed in first-come-first-served order inside their eligible lane, subject to counter availability. Each counter has a small daily efficiency variation and service duration is affected by the service type and late-day fatigue factor.</w:t>
+        <w:t>In this version of my synthetic generator, I route General customers to General counters and Priority customers to Priority counters. Inside each eligible lane I process customers in first-come-first-served order, subject to counter availability. I also give each counter a small daily efficiency variation and let service duration depend on service type and a late-day fatigue factor.</w:t>
       </w:r>
     </w:p>
     <w:p>
@@ -3046,13 +2882,7 @@
         <w:spacing w:after="100" w:line="259" w:lineRule="auto"/>
       </w:pPr>
       <w:r>
-        <w:rPr>
-          <w:rFonts w:ascii="Aptos" w:hAnsi="Aptos"/>
-          <w:i w:val="0"/>
-          <w:color w:val="1F1F1F"/>
-          <w:sz w:val="21"/>
-        </w:rPr>
-        <w:t>The baseline_eta_minutes field is a Smart Q-style deterministic estimate available before the actual wait outcome. It combines the delay until service eligibility with estimated workload already ahead of the customer, divided by effective open capacity. It is not an ML prediction; it is the baseline that a learned model should try to outperform.</w:t>
+        <w:t>I use baseline_eta_minutes as my deterministic SmartQ-style estimate before the real wait outcome is known. I combine the delay until service eligibility with estimated workload ahead and effective open capacity. I do not treat this as an ML prediction; I keep it as an engineering benchmark for the learned models.</w:t>
       </w:r>
     </w:p>
     <w:p>
@@ -3078,13 +2908,7 @@
         <w:spacing w:after="100" w:line="259" w:lineRule="auto"/>
       </w:pPr>
       <w:r>
-        <w:rPr>
-          <w:rFonts w:ascii="Aptos" w:hAnsi="Aptos"/>
-          <w:i w:val="0"/>
-          <w:color w:val="1F1F1F"/>
-          <w:sz w:val="21"/>
-        </w:rPr>
-        <w:t>The synthetic lifecycle can be read as the following sequence:</w:t>
+        <w:t>I represent each synthetic visit using this lifecycle:</w:t>
       </w:r>
     </w:p>
     <w:p>
@@ -3093,12 +2917,7 @@
         <w:spacing w:after="50"/>
       </w:pPr>
       <w:r>
-        <w:rPr>
-          <w:rFonts w:ascii="Aptos" w:hAnsi="Aptos"/>
-          <w:color w:val="1F1F1F"/>
-          <w:sz w:val="20"/>
-        </w:rPr>
-        <w:t>A visit is created as an appointment or walk-in.</w:t>
+        <w:t>I create a visit as an appointment or walk-in.</w:t>
       </w:r>
     </w:p>
     <w:p>
@@ -3107,12 +2926,7 @@
         <w:spacing w:after="50"/>
       </w:pPr>
       <w:r>
-        <w:rPr>
-          <w:rFonts w:ascii="Aptos" w:hAnsi="Aptos"/>
-          <w:color w:val="1F1F1F"/>
-          <w:sz w:val="20"/>
-        </w:rPr>
-        <w:t>For an appointment, the customer may cancel, no-show, or arrive and check in.</w:t>
+        <w:t>For an appointment, I allow the customer to cancel, no-show, or arrive and check in.</w:t>
       </w:r>
     </w:p>
     <w:p>
@@ -3121,12 +2935,7 @@
         <w:spacing w:after="50"/>
       </w:pPr>
       <w:r>
-        <w:rPr>
-          <w:rFonts w:ascii="Aptos" w:hAnsi="Aptos"/>
-          <w:color w:val="1F1F1F"/>
-          <w:sz w:val="20"/>
-        </w:rPr>
-        <w:t>A checked-in customer receives a service eligibility time.</w:t>
+        <w:t>When a customer checks in, I calculate a service-eligibility time.</w:t>
       </w:r>
     </w:p>
     <w:p>
@@ -3135,12 +2944,7 @@
         <w:spacing w:after="50"/>
       </w:pPr>
       <w:r>
-        <w:rPr>
-          <w:rFonts w:ascii="Aptos" w:hAnsi="Aptos"/>
-          <w:color w:val="1F1F1F"/>
-          <w:sz w:val="20"/>
-        </w:rPr>
-        <w:t>Smart Q captures queue and capacity conditions at the prediction/check-in point.</w:t>
+        <w:t>At the prediction/check-in point, I capture queue and capacity conditions.</w:t>
       </w:r>
     </w:p>
     <w:p>
@@ -3149,12 +2953,7 @@
         <w:spacing w:after="50"/>
       </w:pPr>
       <w:r>
-        <w:rPr>
-          <w:rFonts w:ascii="Aptos" w:hAnsi="Aptos"/>
-          <w:color w:val="1F1F1F"/>
-          <w:sz w:val="20"/>
-        </w:rPr>
-        <w:t>When a matching counter becomes available, the customer is called.</w:t>
+        <w:t>When a matching counter becomes available, I call the customer.</w:t>
       </w:r>
     </w:p>
     <w:p>
@@ -3163,12 +2962,7 @@
         <w:spacing w:after="50"/>
       </w:pPr>
       <w:r>
-        <w:rPr>
-          <w:rFonts w:ascii="Aptos" w:hAnsi="Aptos"/>
-          <w:color w:val="1F1F1F"/>
-          <w:sz w:val="20"/>
-        </w:rPr>
-        <w:t>Service begins after a short handoff delay.</w:t>
+        <w:t>I start service after a short handoff delay.</w:t>
       </w:r>
     </w:p>
     <w:p>
@@ -3177,12 +2971,7 @@
         <w:spacing w:after="50"/>
       </w:pPr>
       <w:r>
-        <w:rPr>
-          <w:rFonts w:ascii="Aptos" w:hAnsi="Aptos"/>
-          <w:color w:val="1F1F1F"/>
-          <w:sz w:val="20"/>
-        </w:rPr>
-        <w:t>The service ends after the generated actual service duration.</w:t>
+        <w:t>I end service after the generated actual service duration.</w:t>
       </w:r>
     </w:p>
     <w:p>
@@ -3191,12 +2980,7 @@
         <w:spacing w:after="50"/>
       </w:pPr>
       <w:r>
-        <w:rPr>
-          <w:rFonts w:ascii="Aptos" w:hAnsi="Aptos"/>
-          <w:color w:val="1F1F1F"/>
-          <w:sz w:val="20"/>
-        </w:rPr>
-        <w:t>Actual wait, service duration and variances become labelled outcomes for analysis.</w:t>
+        <w:t>After that, I have labelled outcomes such as actual wait, service duration and variance values for analysis.</w:t>
       </w:r>
     </w:p>
     <w:p>
@@ -3592,13 +3376,7 @@
         <w:spacing w:after="100" w:line="259" w:lineRule="auto"/>
       </w:pPr>
       <w:r>
-        <w:rPr>
-          <w:rFonts w:ascii="Aptos" w:hAnsi="Aptos"/>
-          <w:i w:val="0"/>
-          <w:color w:val="1F1F1F"/>
-          <w:sz w:val="21"/>
-        </w:rPr>
-        <w:t>The following values were calculated directly from the generated 100,000-row file and are not hypothetical targets.</w:t>
+        <w:t>I calculated the following values directly from my generated 100,000-row file. They are measured properties of the synthetic dataset, not hypothetical targets.</w:t>
       </w:r>
     </w:p>
     <w:tbl>
@@ -4266,30 +4044,10 @@
             </w:tcBorders>
           </w:tcPr>
           <w:p>
-            <w:pPr>
-              <w:spacing w:after="40"/>
-            </w:pPr>
-            <w:r>
-              <w:rPr>
-                <w:rFonts w:ascii="Aptos" w:hAnsi="Aptos"/>
-                <w:b/>
-                <w:color w:val="C55A11"/>
-                <w:sz w:val="21"/>
-              </w:rPr>
-              <w:t>Interpreting the long wait tail</w:t>
-            </w:r>
-          </w:p>
-          <w:p>
-            <w:pPr>
-              <w:spacing w:after="0"/>
-            </w:pPr>
-            <w:r>
-              <w:rPr>
-                <w:rFonts w:ascii="Aptos" w:hAnsi="Aptos"/>
-                <w:color w:val="1F1F1F"/>
-                <w:sz w:val="20"/>
-              </w:rPr>
-              <w:t>The maximum wait is intentionally much larger than the average. It represents severe synthetic congestion on an overloaded day. Such outliers are useful when testing whether a model remains stable under unusual queue pressure, but they should be inspected during exploratory analysis.</w:t>
+            <w:r>
+              <w:t>How I interpret the long wait tail</w:t>
+              <w:br/>
+              <w:t>I intentionally allow the maximum wait to be much larger than the median because severe congestion is part of the problem SmartQ is meant to understand. I do not remove a long wait simply because it makes the model harder to fit.</w:t>
             </w:r>
           </w:p>
         </w:tc>
@@ -5187,13 +4945,7 @@
         <w:spacing w:after="100" w:line="259" w:lineRule="auto"/>
       </w:pPr>
       <w:r>
-        <w:rPr>
-          <w:rFonts w:ascii="Aptos" w:hAnsi="Aptos"/>
-          <w:i w:val="0"/>
-          <w:color w:val="1F1F1F"/>
-          <w:sz w:val="21"/>
-        </w:rPr>
-        <w:t>The dataset contains 45 columns. “Pre-outcome” means the field can be available at or before the prediction point. “Outcome” means it is observed only after the queue/service process progresses and should generally not be used as a predictor for wait time at check-in.</w:t>
+        <w:t>My dataset contains 45 columns. I use “Pre-outcome” for fields that can be available at or before the prediction point. I use “Outcome” for fields observed only after the queue/service process has progressed. I generally exclude outcome fields when I predict waiting time at check-in.</w:t>
       </w:r>
     </w:p>
     <w:tbl>
@@ -8947,13 +8699,7 @@
         <w:spacing w:after="100" w:line="259" w:lineRule="auto"/>
       </w:pPr>
       <w:r>
-        <w:rPr>
-          <w:rFonts w:ascii="Aptos" w:hAnsi="Aptos"/>
-          <w:i w:val="0"/>
-          <w:color w:val="1F1F1F"/>
-          <w:sz w:val="21"/>
-        </w:rPr>
-        <w:t>The most natural supervised-learning task is wait-time regression. For completed visits, actual_wait_minutes is the target. The model receives information that would have been available at check-in and predicts how long the customer will wait before being called.</w:t>
+        <w:t>My main supervised-learning task is wait-time regression. For completed visits, I use actual_wait_minutes as the target. I give the model information that would have been available at check-in and ask it to predict how long that customer waits before being called.</w:t>
       </w:r>
     </w:p>
     <w:p>
@@ -8963,13 +8709,7 @@
         <w:spacing w:before="140" w:after="80"/>
       </w:pPr>
       <w:r>
-        <w:rPr>
-          <w:rFonts w:ascii="Aptos" w:hAnsi="Aptos"/>
-          <w:b/>
-          <w:color w:val="2F75B5"/>
-          <w:sz w:val="24"/>
-        </w:rPr>
-        <w:t>7.2 Candidate pre-outcome predictors</w:t>
+        <w:t>7.2 Pre-outcome predictors I considered</w:t>
       </w:r>
     </w:p>
     <w:p>
@@ -8978,12 +8718,7 @@
         <w:spacing w:after="50"/>
       </w:pPr>
       <w:r>
-        <w:rPr>
-          <w:rFonts w:ascii="Aptos" w:hAnsi="Aptos"/>
-          <w:color w:val="1F1F1F"/>
-          <w:sz w:val="20"/>
-        </w:rPr>
-        <w:t>branch_code, service_code, booking_source and queue_type</w:t>
+        <w:t>I considered branch_code, service_code, booking_source and queue_type.</w:t>
       </w:r>
     </w:p>
     <w:p>
@@ -8992,12 +8727,7 @@
         <w:spacing w:after="50"/>
       </w:pPr>
       <w:r>
-        <w:rPr>
-          <w:rFonts w:ascii="Aptos" w:hAnsi="Aptos"/>
-          <w:color w:val="1F1F1F"/>
-          <w:sz w:val="20"/>
-        </w:rPr>
-        <w:t>arrival_offset_minutes and service_eligible_at-derived time features</w:t>
+        <w:t>I considered arrival_offset_minutes and time features derived from service eligibility.</w:t>
       </w:r>
     </w:p>
     <w:p>
@@ -9006,12 +8736,7 @@
         <w:spacing w:after="50"/>
       </w:pPr>
       <w:r>
-        <w:rPr>
-          <w:rFonts w:ascii="Aptos" w:hAnsi="Aptos"/>
-          <w:color w:val="1F1F1F"/>
-          <w:sz w:val="20"/>
-        </w:rPr>
-        <w:t>people_ahead, general_waiting, priority_waiting and serving_count</w:t>
+        <w:t>I considered people_ahead, general_waiting, priority_waiting and serving_count.</w:t>
       </w:r>
     </w:p>
     <w:p>
@@ -9020,12 +8745,7 @@
         <w:spacing w:after="50"/>
       </w:pPr>
       <w:r>
-        <w:rPr>
-          <w:rFonts w:ascii="Aptos" w:hAnsi="Aptos"/>
-          <w:color w:val="1F1F1F"/>
-          <w:sz w:val="20"/>
-        </w:rPr>
-        <w:t>open_general_counters, open_priority_counters and effective_open_counters</w:t>
+        <w:t>I considered open_general_counters, open_priority_counters and effective_open_counters.</w:t>
       </w:r>
     </w:p>
     <w:p>
@@ -9034,12 +8754,7 @@
         <w:spacing w:after="50"/>
       </w:pPr>
       <w:r>
-        <w:rPr>
-          <w:rFonts w:ascii="Aptos" w:hAnsi="Aptos"/>
-          <w:color w:val="1F1F1F"/>
-          <w:sz w:val="20"/>
-        </w:rPr>
-        <w:t>counter_utilisation, queue_pressure_index and workload_minutes_ahead</w:t>
+        <w:t>I considered counter_utilisation, queue_pressure_index and workload_minutes_ahead.</w:t>
       </w:r>
     </w:p>
     <w:p>
@@ -9048,12 +8763,7 @@
         <w:spacing w:after="50"/>
       </w:pPr>
       <w:r>
-        <w:rPr>
-          <w:rFonts w:ascii="Aptos" w:hAnsi="Aptos"/>
-          <w:color w:val="1F1F1F"/>
-          <w:sz w:val="20"/>
-        </w:rPr>
-        <w:t>recent_avg_service_minutes_10, recent_avg_wait_minutes_10 and recent_throughput_60m</w:t>
+        <w:t>I considered recent_avg_service_minutes_10, recent_avg_wait_minutes_10 and recent_throughput_60m.</w:t>
       </w:r>
     </w:p>
     <w:p>
@@ -9062,12 +8772,7 @@
         <w:spacing w:after="50"/>
       </w:pPr>
       <w:r>
-        <w:rPr>
-          <w:rFonts w:ascii="Aptos" w:hAnsi="Aptos"/>
-          <w:color w:val="1F1F1F"/>
-          <w:sz w:val="20"/>
-        </w:rPr>
-        <w:t>service_target_minutes, hour_of_day, day_of_week and is_peak_period</w:t>
+        <w:t>I considered service_target_minutes, hour_of_day, day_of_week and is_peak_period.</w:t>
       </w:r>
     </w:p>
     <w:p>
@@ -9076,12 +8781,7 @@
         <w:spacing w:after="50"/>
       </w:pPr>
       <w:r>
-        <w:rPr>
-          <w:rFonts w:ascii="Aptos" w:hAnsi="Aptos"/>
-          <w:color w:val="1F1F1F"/>
-          <w:sz w:val="20"/>
-        </w:rPr>
-        <w:t>baseline_eta_minutes, either as a comparison baseline or as an optional model feature depending on the experiment design</w:t>
+        <w:t>I kept baseline_eta_minutes as a comparison benchmark rather than an official model input in my final experiment.</w:t>
       </w:r>
     </w:p>
     <w:p>
@@ -9091,13 +8791,7 @@
         <w:spacing w:before="140" w:after="80"/>
       </w:pPr>
       <w:r>
-        <w:rPr>
-          <w:rFonts w:ascii="Aptos" w:hAnsi="Aptos"/>
-          <w:b/>
-          <w:color w:val="2F75B5"/>
-          <w:sz w:val="24"/>
-        </w:rPr>
-        <w:t>7.3 Leakage fields to exclude from wait-time features</w:t>
+        <w:t>7.3 Leakage fields I exclude from wait-time features</w:t>
       </w:r>
     </w:p>
     <w:p>
@@ -9107,13 +8801,7 @@
         <w:spacing w:after="100" w:line="259" w:lineRule="auto"/>
       </w:pPr>
       <w:r>
-        <w:rPr>
-          <w:rFonts w:ascii="Aptos" w:hAnsi="Aptos"/>
-          <w:i w:val="0"/>
-          <w:color w:val="1F1F1F"/>
-          <w:sz w:val="21"/>
-        </w:rPr>
-        <w:t>A model predicting wait at check-in must not receive information that becomes known only after the customer is called or served. At minimum, exclude the following as predictors:</w:t>
+        <w:t>When I predict wait at check-in, I do not allow the model to receive information that only becomes known after the customer is called or served. I exclude at least the following fields:</w:t>
       </w:r>
     </w:p>
     <w:p>
@@ -9279,13 +8967,7 @@
         <w:spacing w:after="100" w:line="259" w:lineRule="auto"/>
       </w:pPr>
       <w:r>
-        <w:rPr>
-          <w:rFonts w:ascii="Aptos" w:hAnsi="Aptos"/>
-          <w:i w:val="0"/>
-          <w:color w:val="1F1F1F"/>
-          <w:sz w:val="21"/>
-        </w:rPr>
-        <w:t>Because the data is time ordered, a chronological split is preferable to randomly shuffling all rows. One reasonable approach is:</w:t>
+        <w:t>Because my data is time ordered, I prefer a chronological split to randomly shuffling all rows. In my final experiment I split by whole operating dates so earlier dates are used for training, later dates for validation, and the latest dates for testing.</w:t>
       </w:r>
     </w:p>
     <w:tbl>
@@ -9334,18 +9016,8 @@
             <w:vAlign w:val="center"/>
           </w:tcPr>
           <w:p>
-            <w:pPr>
-              <w:spacing w:after="0"/>
-              <w:jc w:val="center"/>
-            </w:pPr>
-            <w:r>
-              <w:rPr>
-                <w:rFonts w:ascii="Aptos" w:hAnsi="Aptos"/>
-                <w:b/>
-                <w:color w:val="FFFFFF"/>
-                <w:sz w:val="18"/>
-              </w:rPr>
-              <w:t>Illustrative rule</w:t>
+            <w:r>
+              <w:t>My actual rule</w:t>
             </w:r>
           </w:p>
         </w:tc>
@@ -9356,18 +9028,8 @@
             <w:vAlign w:val="center"/>
           </w:tcPr>
           <w:p>
-            <w:pPr>
-              <w:spacing w:after="0"/>
-              <w:jc w:val="center"/>
-            </w:pPr>
-            <w:r>
-              <w:rPr>
-                <w:rFonts w:ascii="Aptos" w:hAnsi="Aptos"/>
-                <w:b/>
-                <w:color w:val="FFFFFF"/>
-                <w:sz w:val="18"/>
-              </w:rPr>
-              <w:t>Purpose</w:t>
+            <w:r>
+              <w:t>Why I use it</w:t>
             </w:r>
           </w:p>
         </w:tc>
@@ -9379,15 +9041,7 @@
             <w:vAlign w:val="top"/>
           </w:tcPr>
           <w:p>
-            <w:pPr>
-              <w:spacing w:after="0" w:line="240" w:lineRule="auto"/>
-            </w:pPr>
-            <w:r>
-              <w:rPr>
-                <w:rFonts w:ascii="Aptos" w:hAnsi="Aptos"/>
-                <w:color w:val="1F1F1F"/>
-                <w:sz w:val="18"/>
-              </w:rPr>
+            <w:r>
               <w:t>Training</w:t>
             </w:r>
           </w:p>
@@ -9398,16 +9052,8 @@
             <w:vAlign w:val="top"/>
           </w:tcPr>
           <w:p>
-            <w:pPr>
-              <w:spacing w:after="0" w:line="240" w:lineRule="auto"/>
-            </w:pPr>
-            <w:r>
-              <w:rPr>
-                <w:rFonts w:ascii="Aptos" w:hAnsi="Aptos"/>
-                <w:color w:val="1F1F1F"/>
-                <w:sz w:val="18"/>
-              </w:rPr>
-              <w:t>Earliest 70% of operating dates</w:t>
+            <w:r>
+              <w:t>2026-01-02 to 2026-06-16</w:t>
             </w:r>
           </w:p>
         </w:tc>
@@ -9417,16 +9063,8 @@
             <w:vAlign w:val="top"/>
           </w:tcPr>
           <w:p>
-            <w:pPr>
-              <w:spacing w:after="0" w:line="240" w:lineRule="auto"/>
-            </w:pPr>
-            <w:r>
-              <w:rPr>
-                <w:rFonts w:ascii="Aptos" w:hAnsi="Aptos"/>
-                <w:color w:val="1F1F1F"/>
-                <w:sz w:val="18"/>
-              </w:rPr>
-              <w:t>Fit model parameters.</w:t>
+            <w:r>
+              <w:t>I fit preprocessing and model parameters.</w:t>
             </w:r>
           </w:p>
         </w:tc>
@@ -9439,15 +9077,7 @@
             <w:shd w:fill="F7F9FC"/>
           </w:tcPr>
           <w:p>
-            <w:pPr>
-              <w:spacing w:after="0" w:line="240" w:lineRule="auto"/>
-            </w:pPr>
-            <w:r>
-              <w:rPr>
-                <w:rFonts w:ascii="Aptos" w:hAnsi="Aptos"/>
-                <w:color w:val="1F1F1F"/>
-                <w:sz w:val="18"/>
-              </w:rPr>
+            <w:r>
               <w:t>Validation</w:t>
             </w:r>
           </w:p>
@@ -9459,16 +9089,8 @@
             <w:shd w:fill="F7F9FC"/>
           </w:tcPr>
           <w:p>
-            <w:pPr>
-              <w:spacing w:after="0" w:line="240" w:lineRule="auto"/>
-            </w:pPr>
-            <w:r>
-              <w:rPr>
-                <w:rFonts w:ascii="Aptos" w:hAnsi="Aptos"/>
-                <w:color w:val="1F1F1F"/>
-                <w:sz w:val="18"/>
-              </w:rPr>
-              <w:t>Next 15% of operating dates</w:t>
+            <w:r>
+              <w:t>2026-06-17 to 2026-07-22</w:t>
             </w:r>
           </w:p>
         </w:tc>
@@ -9479,16 +9101,8 @@
             <w:shd w:fill="F7F9FC"/>
           </w:tcPr>
           <w:p>
-            <w:pPr>
-              <w:spacing w:after="0" w:line="240" w:lineRule="auto"/>
-            </w:pPr>
-            <w:r>
-              <w:rPr>
-                <w:rFonts w:ascii="Aptos" w:hAnsi="Aptos"/>
-                <w:color w:val="1F1F1F"/>
-                <w:sz w:val="18"/>
-              </w:rPr>
-              <w:t>Tune hyperparameters and compare approaches.</w:t>
+            <w:r>
+              <w:t>I compare models and limited tuning choices.</w:t>
             </w:r>
           </w:p>
         </w:tc>
@@ -9500,15 +9114,7 @@
             <w:vAlign w:val="top"/>
           </w:tcPr>
           <w:p>
-            <w:pPr>
-              <w:spacing w:after="0" w:line="240" w:lineRule="auto"/>
-            </w:pPr>
-            <w:r>
-              <w:rPr>
-                <w:rFonts w:ascii="Aptos" w:hAnsi="Aptos"/>
-                <w:color w:val="1F1F1F"/>
-                <w:sz w:val="18"/>
-              </w:rPr>
+            <w:r>
               <w:t>Test</w:t>
             </w:r>
           </w:p>
@@ -9519,16 +9125,8 @@
             <w:vAlign w:val="top"/>
           </w:tcPr>
           <w:p>
-            <w:pPr>
-              <w:spacing w:after="0" w:line="240" w:lineRule="auto"/>
-            </w:pPr>
-            <w:r>
-              <w:rPr>
-                <w:rFonts w:ascii="Aptos" w:hAnsi="Aptos"/>
-                <w:color w:val="1F1F1F"/>
-                <w:sz w:val="18"/>
-              </w:rPr>
-              <w:t>Final 15% of operating dates</w:t>
+            <w:r>
+              <w:t>2026-07-23 to 2026-08-27</w:t>
             </w:r>
           </w:p>
         </w:tc>
@@ -9538,16 +9136,8 @@
             <w:vAlign w:val="top"/>
           </w:tcPr>
           <w:p>
-            <w:pPr>
-              <w:spacing w:after="0" w:line="240" w:lineRule="auto"/>
-            </w:pPr>
-            <w:r>
-              <w:rPr>
-                <w:rFonts w:ascii="Aptos" w:hAnsi="Aptos"/>
-                <w:color w:val="1F1F1F"/>
-                <w:sz w:val="18"/>
-              </w:rPr>
-              <w:t>Final unbiased synthetic evaluation.</w:t>
+            <w:r>
+              <w:t>I use this as my final later-date evaluation.</w:t>
             </w:r>
           </w:p>
         </w:tc>
@@ -9566,13 +9156,7 @@
         <w:spacing w:after="100" w:line="259" w:lineRule="auto"/>
       </w:pPr>
       <w:r>
-        <w:rPr>
-          <w:rFonts w:ascii="Aptos" w:hAnsi="Aptos"/>
-          <w:i w:val="0"/>
-          <w:color w:val="1F1F1F"/>
-          <w:sz w:val="21"/>
-        </w:rPr>
-        <w:t>Useful regression metrics include MAE, RMSE, median absolute error and signed bias. Because Smart Q already has baseline_eta_minutes, every model should also be compared directly against the deterministic baseline on the same test period.</w:t>
+        <w:t>I use MAE and RMSE as my main regression metrics, and I also inspect R², residual behaviour and other diagnostics. I compare my learned models against both a simple mean-wait baseline and the existing deterministic baseline_eta_minutes benchmark.</w:t>
       </w:r>
     </w:p>
     <w:p>
@@ -9659,16 +9243,8 @@
             <w:vAlign w:val="top"/>
           </w:tcPr>
           <w:p>
-            <w:pPr>
-              <w:spacing w:after="0" w:line="240" w:lineRule="auto"/>
-            </w:pPr>
-            <w:r>
-              <w:rPr>
-                <w:rFonts w:ascii="Aptos" w:hAnsi="Aptos"/>
-                <w:color w:val="1F1F1F"/>
-                <w:sz w:val="18"/>
-              </w:rPr>
-              <w:t>Linear / Ridge Regression</w:t>
+            <w:r>
+              <w:t>Linear Regression</w:t>
             </w:r>
           </w:p>
         </w:tc>
@@ -9678,16 +9254,8 @@
             <w:vAlign w:val="top"/>
           </w:tcPr>
           <w:p>
-            <w:pPr>
-              <w:spacing w:after="0" w:line="240" w:lineRule="auto"/>
-            </w:pPr>
-            <w:r>
-              <w:rPr>
-                <w:rFonts w:ascii="Aptos" w:hAnsi="Aptos"/>
-                <w:color w:val="1F1F1F"/>
-                <w:sz w:val="18"/>
-              </w:rPr>
-              <w:t>Simple, interpretable baseline and good for identifying broad relationships.</w:t>
+            <w:r>
+              <w:t>I use it as my simple, interpretable regression reference.</w:t>
             </w:r>
           </w:p>
         </w:tc>
@@ -9700,15 +9268,7 @@
             <w:shd w:fill="F7F9FC"/>
           </w:tcPr>
           <w:p>
-            <w:pPr>
-              <w:spacing w:after="0" w:line="240" w:lineRule="auto"/>
-            </w:pPr>
-            <w:r>
-              <w:rPr>
-                <w:rFonts w:ascii="Aptos" w:hAnsi="Aptos"/>
-                <w:color w:val="1F1F1F"/>
-                <w:sz w:val="18"/>
-              </w:rPr>
+            <w:r>
               <w:t>Random Forest</w:t>
             </w:r>
           </w:p>
@@ -9720,16 +9280,8 @@
             <w:shd w:fill="F7F9FC"/>
           </w:tcPr>
           <w:p>
-            <w:pPr>
-              <w:spacing w:after="0" w:line="240" w:lineRule="auto"/>
-            </w:pPr>
-            <w:r>
-              <w:rPr>
-                <w:rFonts w:ascii="Aptos" w:hAnsi="Aptos"/>
-                <w:color w:val="1F1F1F"/>
-                <w:sz w:val="18"/>
-              </w:rPr>
-              <w:t>Handles non-linear interactions and mixed operational features with little preprocessing.</w:t>
+            <w:r>
+              <w:t>I use it to capture nonlinear queue interactions with many averaged trees.</w:t>
             </w:r>
           </w:p>
         </w:tc>
@@ -9741,16 +9293,8 @@
             <w:vAlign w:val="top"/>
           </w:tcPr>
           <w:p>
-            <w:pPr>
-              <w:spacing w:after="0" w:line="240" w:lineRule="auto"/>
-            </w:pPr>
-            <w:r>
-              <w:rPr>
-                <w:rFonts w:ascii="Aptos" w:hAnsi="Aptos"/>
-                <w:color w:val="1F1F1F"/>
-                <w:sz w:val="18"/>
-              </w:rPr>
-              <w:t>Gradient Boosting</w:t>
+            <w:r>
+              <w:t>XGBoost</w:t>
             </w:r>
           </w:p>
         </w:tc>
@@ -9760,16 +9304,8 @@
             <w:vAlign w:val="top"/>
           </w:tcPr>
           <w:p>
-            <w:pPr>
-              <w:spacing w:after="0" w:line="240" w:lineRule="auto"/>
-            </w:pPr>
-            <w:r>
-              <w:rPr>
-                <w:rFonts w:ascii="Aptos" w:hAnsi="Aptos"/>
-                <w:color w:val="1F1F1F"/>
-                <w:sz w:val="18"/>
-              </w:rPr>
-              <w:t>Often strong on structured/tabular operational data.</w:t>
+            <w:r>
+              <w:t>I use it as a strong boosted-tree model for structured SmartQ data.</w:t>
             </w:r>
           </w:p>
         </w:tc>
@@ -9782,16 +9318,8 @@
             <w:shd w:fill="F7F9FC"/>
           </w:tcPr>
           <w:p>
-            <w:pPr>
-              <w:spacing w:after="0" w:line="240" w:lineRule="auto"/>
-            </w:pPr>
-            <w:r>
-              <w:rPr>
-                <w:rFonts w:ascii="Aptos" w:hAnsi="Aptos"/>
-                <w:color w:val="1F1F1F"/>
-                <w:sz w:val="18"/>
-              </w:rPr>
-              <w:t>Small Neural Network</w:t>
+            <w:r>
+              <w:t>Future hybrid approach</w:t>
             </w:r>
           </w:p>
         </w:tc>
@@ -9802,16 +9330,8 @@
             <w:shd w:fill="F7F9FC"/>
           </w:tcPr>
           <w:p>
-            <w:pPr>
-              <w:spacing w:after="0" w:line="240" w:lineRule="auto"/>
-            </w:pPr>
-            <w:r>
-              <w:rPr>
-                <w:rFonts w:ascii="Aptos" w:hAnsi="Aptos"/>
-                <w:color w:val="1F1F1F"/>
-                <w:sz w:val="18"/>
-              </w:rPr>
-              <w:t>Feasible with 100k rows; useful for comparison if carefully regularised.</w:t>
+            <w:r>
+              <w:t>I could later test ML that learns residual error on top of my deterministic ETA, but I kept this outside the official comparison.</w:t>
             </w:r>
           </w:p>
         </w:tc>
@@ -9846,30 +9366,10 @@
             </w:tcBorders>
           </w:tcPr>
           <w:p>
-            <w:pPr>
-              <w:spacing w:after="40"/>
-            </w:pPr>
-            <w:r>
-              <w:rPr>
-                <w:rFonts w:ascii="Aptos" w:hAnsi="Aptos"/>
-                <w:b/>
-                <w:color w:val="548235"/>
-                <w:sz w:val="21"/>
-              </w:rPr>
-              <w:t>Model-selection principle</w:t>
-            </w:r>
-          </w:p>
-          <w:p>
-            <w:pPr>
-              <w:spacing w:after="0"/>
-            </w:pPr>
-            <w:r>
-              <w:rPr>
-                <w:rFonts w:ascii="Aptos" w:hAnsi="Aptos"/>
-                <w:color w:val="1F1F1F"/>
-                <w:sz w:val="20"/>
-              </w:rPr>
-              <w:t>A more complex model should be adopted only if it improves accuracy over the deterministic Smart Q baseline and remains operationally understandable and stable. The purpose is better queue prediction, not adding AI for appearance.</w:t>
+            <w:r>
+              <w:t>My model-selection principle</w:t>
+              <w:br/>
+              <w:t>I only adopt a more complex model when it improves validation performance enough to justify the extra complexity. In my final project comparison I select the official model using validation MAE, not final test results.</w:t>
             </w:r>
           </w:p>
         </w:tc>
@@ -9904,13 +9404,7 @@
         <w:spacing w:after="100" w:line="259" w:lineRule="auto"/>
       </w:pPr>
       <w:r>
-        <w:rPr>
-          <w:rFonts w:ascii="Aptos" w:hAnsi="Aptos"/>
-          <w:i w:val="0"/>
-          <w:color w:val="1F1F1F"/>
-          <w:sz w:val="21"/>
-        </w:rPr>
-        <w:t>The dataset is intentionally useful for research, but it has boundaries that should be stated explicitly in a report or presentation.</w:t>
+        <w:t>My dataset is useful for research and learning, but I keep its boundaries explicit in my report and presentation.</w:t>
       </w:r>
     </w:p>
     <w:tbl>
@@ -10266,30 +9760,10 @@
             </w:tcBorders>
           </w:tcPr>
           <w:p>
-            <w:pPr>
-              <w:spacing w:after="40"/>
-            </w:pPr>
-            <w:r>
-              <w:rPr>
-                <w:rFonts w:ascii="Aptos" w:hAnsi="Aptos"/>
-                <w:b/>
-                <w:color w:val="17365D"/>
-                <w:sz w:val="21"/>
-              </w:rPr>
-              <w:t>Suggested disclosure</w:t>
-            </w:r>
-          </w:p>
-          <w:p>
-            <w:pPr>
-              <w:spacing w:after="0"/>
-            </w:pPr>
-            <w:r>
-              <w:rPr>
-                <w:rFonts w:ascii="Aptos" w:hAnsi="Aptos"/>
-                <w:color w:val="1F1F1F"/>
-                <w:sz w:val="20"/>
-              </w:rPr>
-              <w:t>A 100,000-row synthetic operational dataset was generated to emulate the queue observations that Smart Q is designed to collect. The synthetic data was used to develop and compare forecasting methods in a controlled, privacy-preserving environment. Results on this dataset demonstrate the methodology and relative model behaviour, but do not substitute for later validation using real operational data.</w:t>
+            <w:r>
+              <w:t>My recommended disclosure</w:t>
+              <w:br/>
+              <w:t>I generated a 100,000-row synthetic operational dataset to support SmartQ ML development. I use it to demonstrate the modelling process, not to claim guaranteed production accuracy.</w:t>
             </w:r>
           </w:p>
         </w:tc>
@@ -10404,16 +9878,8 @@
             <w:vAlign w:val="top"/>
           </w:tcPr>
           <w:p>
-            <w:pPr>
-              <w:spacing w:after="0" w:line="240" w:lineRule="auto"/>
-            </w:pPr>
-            <w:r>
-              <w:rPr>
-                <w:rFonts w:ascii="Aptos" w:hAnsi="Aptos"/>
-                <w:color w:val="1F1F1F"/>
-                <w:sz w:val="18"/>
-              </w:rPr>
-              <w:t>Full 100,000-row dataset used for analysis and machine learning.</w:t>
+            <w:r>
+              <w:t>I use this as the full 100,000-row dataset for analysis and machine learning.</w:t>
             </w:r>
           </w:p>
         </w:tc>
@@ -10446,16 +9912,8 @@
             <w:shd w:fill="F7F9FC"/>
           </w:tcPr>
           <w:p>
-            <w:pPr>
-              <w:spacing w:after="0" w:line="240" w:lineRule="auto"/>
-            </w:pPr>
-            <w:r>
-              <w:rPr>
-                <w:rFonts w:ascii="Aptos" w:hAnsi="Aptos"/>
-                <w:color w:val="1F1F1F"/>
-                <w:sz w:val="18"/>
-              </w:rPr>
-              <w:t>Read-me, validation summary, 45-column dictionary and 1,000-row preview.</w:t>
+            <w:r>
+              <w:t>I use this as a companion read-me, validation summary, data dictionary and 1,000-row preview.</w:t>
             </w:r>
           </w:p>
         </w:tc>
@@ -10486,16 +9944,8 @@
             <w:vAlign w:val="top"/>
           </w:tcPr>
           <w:p>
-            <w:pPr>
-              <w:spacing w:after="0" w:line="240" w:lineRule="auto"/>
-            </w:pPr>
-            <w:r>
-              <w:rPr>
-                <w:rFonts w:ascii="Aptos" w:hAnsi="Aptos"/>
-                <w:color w:val="1F1F1F"/>
-                <w:sz w:val="18"/>
-              </w:rPr>
-              <w:t>This narrative documentation.</w:t>
+            <w:r>
+              <w:t>I use this document to explain how I designed, validated and use the dataset.</w:t>
             </w:r>
           </w:p>
         </w:tc>
@@ -10514,13 +9964,7 @@
         <w:spacing w:before="200" w:after="80"/>
       </w:pPr>
       <w:r>
-        <w:rPr>
-          <w:rFonts w:ascii="Aptos" w:hAnsi="Aptos"/>
-          <w:b/>
-          <w:color w:val="17365D"/>
-          <w:sz w:val="30"/>
-        </w:rPr>
-        <w:t>10. Final Summary</w:t>
+        <w:t>10. My Final Summary</w:t>
       </w:r>
     </w:p>
     <w:p>
@@ -10530,13 +9974,7 @@
         <w:spacing w:after="100" w:line="259" w:lineRule="auto"/>
       </w:pPr>
       <w:r>
-        <w:rPr>
-          <w:rFonts w:ascii="Aptos" w:hAnsi="Aptos"/>
-          <w:i w:val="0"/>
-          <w:color w:val="1F1F1F"/>
-          <w:sz w:val="21"/>
-        </w:rPr>
-        <w:t>The Smart Q 100,000-row synthetic dataset is a privacy-preserving research dataset built to represent queue demand, appointment and walk-in behaviour, service eligibility, queue pressure, counter capacity, baseline ETA, waiting outcomes and service outcomes over many simulated operating days. Its main value is that the features are temporally linked rather than independently random, allowing realistic experiments in queue analytics and wait-time prediction.</w:t>
+        <w:t>I built the SmartQ 100,000-row synthetic dataset as a privacy-preserving research dataset that represents queue demand, appointment and walk-in behaviour, service eligibility, queue pressure, counter capacity, baseline ETA, waiting outcomes and service outcomes over many simulated operating days. I linked the features temporally instead of creating independent random rows so I could run more realistic queue-analytics and waiting-time experiments.</w:t>
       </w:r>
     </w:p>
     <w:p>
@@ -10546,13 +9984,7 @@
         <w:spacing w:after="100" w:line="259" w:lineRule="auto"/>
       </w:pPr>
       <w:r>
-        <w:rPr>
-          <w:rFonts w:ascii="Aptos" w:hAnsi="Aptos"/>
-          <w:i w:val="0"/>
-          <w:color w:val="1F1F1F"/>
-          <w:sz w:val="21"/>
-        </w:rPr>
-        <w:t>For the Special Topic project, the dataset is best used as a controlled evidence base for comparing forecasting approaches. The strongest academic approach is to keep the synthetic nature explicit, prevent target leakage, split data chronologically, compare every learned model with baseline_eta_minutes, and reserve claims about real-world deployment until genuine Smart Q operational data becomes available.</w:t>
+        <w:t>For my Special Topic project, I use this dataset as a controlled evidence base for comparing waiting-time prediction approaches. I keep the synthetic nature explicit, prevent target leakage, split data chronologically, compare learned models with simple and deterministic baselines, and reserve real-world deployment claims until I have genuine SmartQ operational data.</w:t>
       </w:r>
     </w:p>
     <w:sectPr>

</xml_diff>